<commit_message>
docs: include advance payment models (full, partial deposit, pay on arrival) in gap analysis
</commit_message>
<xml_diff>
--- a/Docs/swat-tourism-payment-hotel-trip-completion-gap-analysis.docx
+++ b/Docs/swat-tourism-payment-hotel-trip-completion-gap-analysis.docx
@@ -27,7 +27,7 @@
           <w:color w:val="088395"/>
           <w:sz w:val="26"/>
         </w:rPr>
-        <w:t>Comprehensive Architectural Gap Analysis &amp; Technical Implementation Plan</w:t>
+        <w:t>Architectural Gap Analysis, Advance Payment Rules &amp; Production Roadmap</w:t>
       </w:r>
     </w:p>
     <w:tbl>
@@ -142,7 +142,7 @@
                 <w:color w:val="2D3748"/>
                 <w:sz w:val="19"/>
               </w:rPr>
-              <w:t>Tourist Checkout, Hotel Stay Management, Trip Lifecycle Completion</w:t>
+              <w:t>Advance Payment Models (Full/Partial), Hotel Front Desk, Trip Completion</w:t>
             </w:r>
           </w:p>
         </w:tc>
@@ -248,7 +248,7 @@
                 <w:color w:val="2D3748"/>
                 <w:sz w:val="19"/>
               </w:rPr>
-              <w:t>October 2026 | Production Readiness Assessment (Active)</w:t>
+              <w:t>October 2026 | Production Readiness Assessment (Updated)</w:t>
             </w:r>
           </w:p>
         </w:tc>
@@ -283,7 +283,7 @@
           <w:color w:val="2D3748"/>
           <w:sz w:val="20"/>
         </w:rPr>
-        <w:t>The Swat Tourism Platform (STP) has achieved rich discovery, booking request pipelines, transport fleet management, and physical room rack allocation. However, bridging the platform into a mission-critical commercial engine requires closing foundational architectural gaps across three interconnected domains: (1) multi-channel digital payments and checkout bundling, (2) the physical hotel stay operational lifecycle (from front-desk check-in through in-stay folios and housekeeping turnover), and (3) automated trip completion triggers with verified multi-entity traveler feedback loops.</w:t>
+        <w:t>The Swat Tourism Platform (STP) has achieved rich discovery, booking request pipelines, transport fleet management, and physical room rack allocation. However, transitioning the platform into a commercial hospitality standard requires addressing key functional requirements: (1) multi-channel digital payments and flexible advance deposit options, (2) the physical hotel stay operational lifecycle (from front-desk check-in through in-stay folios and room turnover), and (3) automated trip completion triggers with verified multi-entity traveler feedback loops.</w:t>
       </w:r>
     </w:p>
     <w:tbl>
@@ -333,7 +333,7 @@
                 <w:color w:val="2D3748"/>
                 <w:sz w:val="20"/>
               </w:rPr>
-              <w:t>The frontend prototype currently bypasses real checkout by executing a simulated toast callback on 'Pay Entire Trip', while the hotel portal displays static check-in text without action buttons for staff to check guests into physical rooms or turn rooms over. Implementing a unified 'SwatPay' checkout modal alongside an interactive Hotel Front-Desk workflow will elevate STP into a production-grade digital hospitality standard.</w:t>
+              <w:t>The backend database schema already defines 'deposit_amount' and supports payment_status values ('unpaid', 'deposit_paid', 'paid', 'refunded'). However, the frontend UI currently lacks the interactive controls for tourists to select Full vs. Partial Deposit payment, and the Hotel Today Screen does not show front-desk staff the outstanding balance due upon guest arrival. Integrating this into the SwatPay modal and Hotel Check-In workflow is an essential deliverable.</w:t>
             </w:r>
           </w:p>
         </w:tc>
@@ -368,7 +368,7 @@
           <w:color w:val="2D3748"/>
           <w:sz w:val="20"/>
         </w:rPr>
-        <w:t>Tourism dynamics across Swat Valley (encompassing Mingora, Bahrain, Madyan, Kalam, Mahodand Lake, Malam Jabba, and Ushu) require a multi-tiered payment structure. Domestic travelers overwhelmingly rely on Easypaisa and JazzCash mobile wallets, corporate and banking customers leverage SBP Raast instant QR codes, overseas diaspora utilize Visa/Mastercard, while remote mountain outposts require a reservation guarantee safety net with Pay-on-Arrival.</w:t>
+        <w:t>Tourism dynamics across Swat Valley require a resilient, multi-rail payment architecture accommodating Easypaisa and JazzCash mobile wallets, SBP Raast instant QR codes, international credit/debit cards, and offline reservation guarantees for remote alpine areas.</w:t>
       </w:r>
     </w:p>
     <w:tbl>
@@ -826,7 +826,7 @@
           <w:color w:val="0A4D68"/>
           <w:sz w:val="32"/>
         </w:rPr>
-        <w:t>3. Hotel Stay Operational Lifecycle &amp; Room Operations</w:t>
+        <w:t>3. Advance Payment Policy: Full vs. Partial Deposit vs. Pay-on-Arrival</w:t>
       </w:r>
     </w:p>
     <w:p>
@@ -839,7 +839,489 @@
           <w:color w:val="2D3748"/>
           <w:sz w:val="20"/>
         </w:rPr>
-        <w:t>A hotel reservation does not end with booking acceptance; it transitions through a physical on-property lifecycle: Arrival Verification -&gt; Room Key Handover -&gt; In-House Stay -&gt; Incidentals/Folio Charges -&gt; Check-Out &amp; Billing -&gt; Housekeeping Turnover. The current portal implements room allocation but lacks real-time operational execution.</w:t>
+        <w:t>A critical question in hospitality platforms is whether booking confirmation requires full upfront payment, a partial deposit, or zero advance payment. In the Swat Tourism Platform, the underlying database model already supports multiple commercial policies via 'deposit_amount' (Numeric) and 'payment_status' ('unpaid', 'deposit_paid', 'paid', 'refunded'). The platform establishes three distinct operational models:</w:t>
+      </w:r>
+    </w:p>
+    <w:tbl>
+      <w:tblPr>
+        <w:tblW w:type="auto" w:w="0"/>
+        <w:jc w:val="center"/>
+        <w:tblLayout w:type="fixed"/>
+        <w:tblLook w:firstColumn="1" w:firstRow="1" w:lastColumn="0" w:lastRow="0" w:noHBand="0" w:noVBand="1" w:val="04A0"/>
+      </w:tblPr>
+      <w:tblGrid>
+        <w:gridCol w:w="2520"/>
+        <w:gridCol w:w="2520"/>
+        <w:gridCol w:w="2520"/>
+        <w:gridCol w:w="2520"/>
+      </w:tblGrid>
+      <w:tr>
+        <w:tc>
+          <w:tcPr>
+            <w:tcW w:type="dxa" w:w="2160"/>
+            <w:shd w:fill="0E8388"/>
+            <w:tcMar>
+              <w:top w:w="120" w:type="dxa"/>
+              <w:bottom w:w="120" w:type="dxa"/>
+              <w:left w:w="140" w:type="dxa"/>
+              <w:right w:w="140" w:type="dxa"/>
+            </w:tcMar>
+          </w:tcPr>
+          <w:p>
+            <w:pPr>
+              <w:jc w:val="left"/>
+            </w:pPr>
+            <w:r>
+              <w:rPr>
+                <w:rFonts w:ascii="Calibri" w:hAnsi="Calibri"/>
+                <w:b/>
+                <w:color w:val="FFFFFF"/>
+                <w:sz w:val="19"/>
+              </w:rPr>
+              <w:t>Payment Model</w:t>
+            </w:r>
+          </w:p>
+        </w:tc>
+        <w:tc>
+          <w:tcPr>
+            <w:tcW w:type="dxa" w:w="2016"/>
+            <w:shd w:fill="0E8388"/>
+            <w:tcMar>
+              <w:top w:w="120" w:type="dxa"/>
+              <w:bottom w:w="120" w:type="dxa"/>
+              <w:left w:w="140" w:type="dxa"/>
+              <w:right w:w="140" w:type="dxa"/>
+            </w:tcMar>
+          </w:tcPr>
+          <w:p>
+            <w:pPr>
+              <w:jc w:val="left"/>
+            </w:pPr>
+            <w:r>
+              <w:rPr>
+                <w:rFonts w:ascii="Calibri" w:hAnsi="Calibri"/>
+                <w:b/>
+                <w:color w:val="FFFFFF"/>
+                <w:sz w:val="19"/>
+              </w:rPr>
+              <w:t>Advance Required</w:t>
+            </w:r>
+          </w:p>
+        </w:tc>
+        <w:tc>
+          <w:tcPr>
+            <w:tcW w:type="dxa" w:w="3024"/>
+            <w:shd w:fill="0E8388"/>
+            <w:tcMar>
+              <w:top w:w="120" w:type="dxa"/>
+              <w:bottom w:w="120" w:type="dxa"/>
+              <w:left w:w="140" w:type="dxa"/>
+              <w:right w:w="140" w:type="dxa"/>
+            </w:tcMar>
+          </w:tcPr>
+          <w:p>
+            <w:pPr>
+              <w:jc w:val="left"/>
+            </w:pPr>
+            <w:r>
+              <w:rPr>
+                <w:rFonts w:ascii="Calibri" w:hAnsi="Calibri"/>
+                <w:b/>
+                <w:color w:val="FFFFFF"/>
+                <w:sz w:val="19"/>
+              </w:rPr>
+              <w:t>Booking Status &amp; Confirmation Rules</w:t>
+            </w:r>
+          </w:p>
+        </w:tc>
+        <w:tc>
+          <w:tcPr>
+            <w:tcW w:type="dxa" w:w="2160"/>
+            <w:shd w:fill="0E8388"/>
+            <w:tcMar>
+              <w:top w:w="120" w:type="dxa"/>
+              <w:bottom w:w="120" w:type="dxa"/>
+              <w:left w:w="140" w:type="dxa"/>
+              <w:right w:w="140" w:type="dxa"/>
+            </w:tcMar>
+          </w:tcPr>
+          <w:p>
+            <w:pPr>
+              <w:jc w:val="left"/>
+            </w:pPr>
+            <w:r>
+              <w:rPr>
+                <w:rFonts w:ascii="Calibri" w:hAnsi="Calibri"/>
+                <w:b/>
+                <w:color w:val="FFFFFF"/>
+                <w:sz w:val="19"/>
+              </w:rPr>
+              <w:t>Front-Desk Balance Due</w:t>
+            </w:r>
+          </w:p>
+        </w:tc>
+      </w:tr>
+      <w:tr>
+        <w:tc>
+          <w:tcPr>
+            <w:tcW w:type="dxa" w:w="2160"/>
+            <w:shd w:fill="FFFFFF"/>
+            <w:tcMar>
+              <w:top w:w="100" w:type="dxa"/>
+              <w:bottom w:w="100" w:type="dxa"/>
+              <w:left w:w="140" w:type="dxa"/>
+              <w:right w:w="140" w:type="dxa"/>
+            </w:tcMar>
+          </w:tcPr>
+          <w:p>
+            <w:r>
+              <w:rPr>
+                <w:rFonts w:ascii="Calibri" w:hAnsi="Calibri"/>
+                <w:color w:val="2D3748"/>
+                <w:sz w:val="18"/>
+              </w:rPr>
+              <w:t>1. Full Advance Payment</w:t>
+              <w:br/>
+              <w:t>(100% Upfront)</w:t>
+            </w:r>
+          </w:p>
+        </w:tc>
+        <w:tc>
+          <w:tcPr>
+            <w:tcW w:type="dxa" w:w="2016"/>
+            <w:shd w:fill="FFFFFF"/>
+            <w:tcMar>
+              <w:top w:w="100" w:type="dxa"/>
+              <w:bottom w:w="100" w:type="dxa"/>
+              <w:left w:w="140" w:type="dxa"/>
+              <w:right w:w="140" w:type="dxa"/>
+            </w:tcMar>
+          </w:tcPr>
+          <w:p>
+            <w:r>
+              <w:rPr>
+                <w:rFonts w:ascii="Calibri" w:hAnsi="Calibri"/>
+                <w:color w:val="2D3748"/>
+                <w:sz w:val="18"/>
+              </w:rPr>
+              <w:t>100% of booking total charged at checkout via Easypaisa, JazzCash, Card, or Raast.</w:t>
+            </w:r>
+          </w:p>
+        </w:tc>
+        <w:tc>
+          <w:tcPr>
+            <w:tcW w:type="dxa" w:w="3024"/>
+            <w:shd w:fill="FFFFFF"/>
+            <w:tcMar>
+              <w:top w:w="100" w:type="dxa"/>
+              <w:bottom w:w="100" w:type="dxa"/>
+              <w:left w:w="140" w:type="dxa"/>
+              <w:right w:w="140" w:type="dxa"/>
+            </w:tcMar>
+          </w:tcPr>
+          <w:p>
+            <w:r>
+              <w:rPr>
+                <w:rFonts w:ascii="Calibri" w:hAnsi="Calibri"/>
+                <w:color w:val="2D3748"/>
+                <w:sz w:val="18"/>
+              </w:rPr>
+              <w:t>• status: 'confirmed'</w:t>
+              <w:br/>
+              <w:t>• payment_status: 'paid'</w:t>
+              <w:br/>
+              <w:t>• Confirmed immediately upon gateway webhook confirmation.</w:t>
+            </w:r>
+          </w:p>
+        </w:tc>
+        <w:tc>
+          <w:tcPr>
+            <w:tcW w:type="dxa" w:w="2160"/>
+            <w:shd w:fill="FFFFFF"/>
+            <w:tcMar>
+              <w:top w:w="100" w:type="dxa"/>
+              <w:bottom w:w="100" w:type="dxa"/>
+              <w:left w:w="140" w:type="dxa"/>
+              <w:right w:w="140" w:type="dxa"/>
+            </w:tcMar>
+          </w:tcPr>
+          <w:p>
+            <w:r>
+              <w:rPr>
+                <w:rFonts w:ascii="Calibri" w:hAnsi="Calibri"/>
+                <w:color w:val="2D3748"/>
+                <w:sz w:val="18"/>
+              </w:rPr>
+              <w:t>Balance Due: PKR 0</w:t>
+              <w:br/>
+              <w:t>Guest checked in without financial collection.</w:t>
+            </w:r>
+          </w:p>
+        </w:tc>
+      </w:tr>
+      <w:tr>
+        <w:tc>
+          <w:tcPr>
+            <w:tcW w:type="dxa" w:w="2160"/>
+            <w:shd w:fill="F4F8FA"/>
+            <w:tcMar>
+              <w:top w:w="100" w:type="dxa"/>
+              <w:bottom w:w="100" w:type="dxa"/>
+              <w:left w:w="140" w:type="dxa"/>
+              <w:right w:w="140" w:type="dxa"/>
+            </w:tcMar>
+          </w:tcPr>
+          <w:p>
+            <w:r>
+              <w:rPr>
+                <w:rFonts w:ascii="Calibri" w:hAnsi="Calibri"/>
+                <w:color w:val="2D3748"/>
+                <w:sz w:val="18"/>
+              </w:rPr>
+              <w:t>2. Partial Advance Deposit</w:t>
+              <w:br/>
+              <w:t>(20% - 30% or 1st Night)</w:t>
+            </w:r>
+          </w:p>
+        </w:tc>
+        <w:tc>
+          <w:tcPr>
+            <w:tcW w:type="dxa" w:w="2016"/>
+            <w:shd w:fill="F4F8FA"/>
+            <w:tcMar>
+              <w:top w:w="100" w:type="dxa"/>
+              <w:bottom w:w="100" w:type="dxa"/>
+              <w:left w:w="140" w:type="dxa"/>
+              <w:right w:w="140" w:type="dxa"/>
+            </w:tcMar>
+          </w:tcPr>
+          <w:p>
+            <w:r>
+              <w:rPr>
+                <w:rFonts w:ascii="Calibri" w:hAnsi="Calibri"/>
+                <w:color w:val="2D3748"/>
+                <w:sz w:val="18"/>
+              </w:rPr>
+              <w:t>Partial amount charged upfront (e.g. PKR 5,000 on a PKR 20,000 reservation).</w:t>
+            </w:r>
+          </w:p>
+        </w:tc>
+        <w:tc>
+          <w:tcPr>
+            <w:tcW w:type="dxa" w:w="3024"/>
+            <w:shd w:fill="F4F8FA"/>
+            <w:tcMar>
+              <w:top w:w="100" w:type="dxa"/>
+              <w:bottom w:w="100" w:type="dxa"/>
+              <w:left w:w="140" w:type="dxa"/>
+              <w:right w:w="140" w:type="dxa"/>
+            </w:tcMar>
+          </w:tcPr>
+          <w:p>
+            <w:r>
+              <w:rPr>
+                <w:rFonts w:ascii="Calibri" w:hAnsi="Calibri"/>
+                <w:color w:val="2D3748"/>
+                <w:sz w:val="18"/>
+              </w:rPr>
+              <w:t>• status: 'confirmed'</w:t>
+              <w:br/>
+              <w:t>• payment_status: 'deposit_paid'</w:t>
+              <w:br/>
+              <w:t>• deposit_amount: recorded</w:t>
+              <w:br/>
+              <w:t>• Room is secured on hotel rack.</w:t>
+            </w:r>
+          </w:p>
+        </w:tc>
+        <w:tc>
+          <w:tcPr>
+            <w:tcW w:type="dxa" w:w="2160"/>
+            <w:shd w:fill="F4F8FA"/>
+            <w:tcMar>
+              <w:top w:w="100" w:type="dxa"/>
+              <w:bottom w:w="100" w:type="dxa"/>
+              <w:left w:w="140" w:type="dxa"/>
+              <w:right w:w="140" w:type="dxa"/>
+            </w:tcMar>
+          </w:tcPr>
+          <w:p>
+            <w:r>
+              <w:rPr>
+                <w:rFonts w:ascii="Calibri" w:hAnsi="Calibri"/>
+                <w:color w:val="2D3748"/>
+                <w:sz w:val="18"/>
+              </w:rPr>
+              <w:t>Balance Due: PKR 15,000</w:t>
+              <w:br/>
+              <w:t>Front desk collects remaining balance at check-in or checkout.</w:t>
+            </w:r>
+          </w:p>
+        </w:tc>
+      </w:tr>
+      <w:tr>
+        <w:tc>
+          <w:tcPr>
+            <w:tcW w:type="dxa" w:w="2160"/>
+            <w:shd w:fill="FFFFFF"/>
+            <w:tcMar>
+              <w:top w:w="100" w:type="dxa"/>
+              <w:bottom w:w="100" w:type="dxa"/>
+              <w:left w:w="140" w:type="dxa"/>
+              <w:right w:w="140" w:type="dxa"/>
+            </w:tcMar>
+          </w:tcPr>
+          <w:p>
+            <w:r>
+              <w:rPr>
+                <w:rFonts w:ascii="Calibri" w:hAnsi="Calibri"/>
+                <w:color w:val="2D3748"/>
+                <w:sz w:val="18"/>
+              </w:rPr>
+              <w:t>3. Pay on Arrival</w:t>
+              <w:br/>
+              <w:t>(0% Advance Guarantee)</w:t>
+            </w:r>
+          </w:p>
+        </w:tc>
+        <w:tc>
+          <w:tcPr>
+            <w:tcW w:type="dxa" w:w="2016"/>
+            <w:shd w:fill="FFFFFF"/>
+            <w:tcMar>
+              <w:top w:w="100" w:type="dxa"/>
+              <w:bottom w:w="100" w:type="dxa"/>
+              <w:left w:w="140" w:type="dxa"/>
+              <w:right w:w="140" w:type="dxa"/>
+            </w:tcMar>
+          </w:tcPr>
+          <w:p>
+            <w:r>
+              <w:rPr>
+                <w:rFonts w:ascii="Calibri" w:hAnsi="Calibri"/>
+                <w:color w:val="2D3748"/>
+                <w:sz w:val="18"/>
+              </w:rPr>
+              <w:t>PKR 0 charged upfront. Reservation held via verified mobile / CNIC or card guarantee.</w:t>
+            </w:r>
+          </w:p>
+        </w:tc>
+        <w:tc>
+          <w:tcPr>
+            <w:tcW w:type="dxa" w:w="3024"/>
+            <w:shd w:fill="FFFFFF"/>
+            <w:tcMar>
+              <w:top w:w="100" w:type="dxa"/>
+              <w:bottom w:w="100" w:type="dxa"/>
+              <w:left w:w="140" w:type="dxa"/>
+              <w:right w:w="140" w:type="dxa"/>
+            </w:tcMar>
+          </w:tcPr>
+          <w:p>
+            <w:r>
+              <w:rPr>
+                <w:rFonts w:ascii="Calibri" w:hAnsi="Calibri"/>
+                <w:color w:val="2D3748"/>
+                <w:sz w:val="18"/>
+              </w:rPr>
+              <w:t>• status: 'confirmed'</w:t>
+              <w:br/>
+              <w:t>• payment_status: 'unpaid'</w:t>
+              <w:br/>
+              <w:t>• Guaranteed voucher issued with check-in cancellation cut-off.</w:t>
+            </w:r>
+          </w:p>
+        </w:tc>
+        <w:tc>
+          <w:tcPr>
+            <w:tcW w:type="dxa" w:w="2160"/>
+            <w:shd w:fill="FFFFFF"/>
+            <w:tcMar>
+              <w:top w:w="100" w:type="dxa"/>
+              <w:bottom w:w="100" w:type="dxa"/>
+              <w:left w:w="140" w:type="dxa"/>
+              <w:right w:w="140" w:type="dxa"/>
+            </w:tcMar>
+          </w:tcPr>
+          <w:p>
+            <w:r>
+              <w:rPr>
+                <w:rFonts w:ascii="Calibri" w:hAnsi="Calibri"/>
+                <w:color w:val="2D3748"/>
+                <w:sz w:val="18"/>
+              </w:rPr>
+              <w:t>Balance Due: PKR 20,000</w:t>
+              <w:br/>
+              <w:t>Full payment collected at hotel reception desk.</w:t>
+            </w:r>
+          </w:p>
+        </w:tc>
+      </w:tr>
+    </w:tbl>
+    <w:p>
+      <w:pPr>
+        <w:spacing w:after="120"/>
+      </w:pPr>
+    </w:p>
+    <w:p>
+      <w:pPr>
+        <w:spacing w:line="276" w:lineRule="auto" w:after="80"/>
+      </w:pPr>
+      <w:r>
+        <w:rPr>
+          <w:rFonts w:ascii="Calibri" w:hAnsi="Calibri"/>
+          <w:b/>
+          <w:color w:val="0A4D68"/>
+          <w:sz w:val="22"/>
+        </w:rPr>
+        <w:t>Business Rules &amp; Operational Implementation Requirements:</w:t>
+        <w:br/>
+      </w:r>
+      <w:r>
+        <w:rPr>
+          <w:rFonts w:ascii="Calibri" w:hAnsi="Calibri"/>
+          <w:color w:val="2D3748"/>
+          <w:sz w:val="19"/>
+        </w:rPr>
+        <w:t>1. Dynamic Tourist Selector in SwatPay Modal: The checkout modal must display clear payment choice options: '[X] Pay Full Amount (PKR 24,000 - Guaranteed Best Rate)' vs. '[ ] Pay 25% Deposit (PKR 6,000 now, PKR 18,000 at Hotel)' vs. '[ ] Pay on Arrival (PKR 0 now, PKR 24,000 at Venue)'.</w:t>
+        <w:br/>
+        <w:t>2. Hotel Front-Desk Balance Calculation: When a tourist arrives with payment_status = 'deposit_paid', the Hotel Today Screen must render a prominent badge: 'Deposit Paid: PKR 6,000 • Remaining Balance Due: PKR 18,000'. During check-in or check-out, the front desk records collection of this balance.</w:t>
+        <w:br/>
+        <w:t>3. High-Season Policy Enforcement: For high-demand luxury suites (e.g. Serena Heritage Suite or Malam Jabba Ski Resort in winter), hotel managers can toggle 'Advance Deposit Mandatory' in listing configuration, requiring at least a 25% non-refundable deposit.</w:t>
+        <w:br/>
+        <w:t>4. Cancellation &amp; Refund Rules: If a tourist cancels a deposit-confirmed booking: cancellations made &gt; 48 hours prior to check-in receive a 100% refund of deposit; cancellations &lt; 48 hours forfeit the deposit to compensate the hotel for held room inventory.</w:t>
+      </w:r>
+    </w:p>
+    <w:p>
+      <w:pPr>
+        <w:spacing w:after="160"/>
+      </w:pPr>
+    </w:p>
+    <w:p>
+      <w:pPr>
+        <w:spacing w:before="280" w:after="80"/>
+      </w:pPr>
+      <w:r>
+        <w:rPr>
+          <w:rFonts w:ascii="Calibri" w:hAnsi="Calibri"/>
+          <w:b/>
+          <w:color w:val="0A4D68"/>
+          <w:sz w:val="32"/>
+        </w:rPr>
+        <w:t>4. Hotel Stay Operational Lifecycle &amp; Room Operations</w:t>
+      </w:r>
+    </w:p>
+    <w:p>
+      <w:pPr>
+        <w:spacing w:line="276" w:lineRule="auto" w:after="120"/>
+      </w:pPr>
+      <w:r>
+        <w:rPr>
+          <w:rFonts w:ascii="Calibri" w:hAnsi="Calibri"/>
+          <w:color w:val="2D3748"/>
+          <w:sz w:val="20"/>
+        </w:rPr>
+        <w:t>A hotel reservation transitions through a physical on-property lifecycle: Arrival Verification -&gt; Room Key Handover -&gt; In-House Stay -&gt; Incidentals/Folio Charges -&gt; Check-Out &amp; Billing -&gt; Housekeeping Turnover. The current portal implements room allocation but lacks real-time operational execution.</w:t>
       </w:r>
     </w:p>
     <w:tbl>
@@ -1301,7 +1783,7 @@
           <w:color w:val="0A4D68"/>
           <w:sz w:val="32"/>
         </w:rPr>
-        <w:t>4. Trip Completion Lifecycle &amp; Traveler Feedback Loop</w:t>
+        <w:t>5. Trip Completion Lifecycle &amp; Traveler Feedback Loop</w:t>
       </w:r>
     </w:p>
     <w:p>
@@ -1704,20 +2186,7 @@
           <w:color w:val="0A4D68"/>
           <w:sz w:val="32"/>
         </w:rPr>
-        <w:t>5. Proposed Target Solution Architecture</w:t>
-      </w:r>
-    </w:p>
-    <w:p>
-      <w:pPr>
-        <w:spacing w:line="276" w:lineRule="auto" w:after="120"/>
-      </w:pPr>
-      <w:r>
-        <w:rPr>
-          <w:rFonts w:ascii="Calibri" w:hAnsi="Calibri"/>
-          <w:color w:val="2D3748"/>
-          <w:sz w:val="20"/>
-        </w:rPr>
-        <w:t>To resolve all identified gaps systematically, the engineering roadmap defines three core target modules:</w:t>
+        <w:t>6. Target Solution Architecture &amp; Integration Plan</w:t>
       </w:r>
     </w:p>
     <w:p>
@@ -1740,13 +2209,15 @@
           <w:color w:val="2D3748"/>
           <w:sz w:val="19"/>
         </w:rPr>
-        <w:t>• Supports dual scope: Entire Trip Bundle (aggregated hotel + transport costs) and Single Booking.</w:t>
+        <w:t>• Supports dual scope: Entire Trip Bundle (aggregated costs) and Single Booking.</w:t>
         <w:br/>
-        <w:t>• Features 5 tabbed payment rails: (1) Easypaisa Mobile Account, (2) JazzCash MWALLET, (3) Visa/Mastercard 3DS, (4) SBP Raast Dynamic QR Code, and (5) Pay-on-Arrival Guarantee Voucher.</w:t>
+        <w:t>• Advance Payment Selector: Toggle between (a) Pay in Full (100%), (b) Pay Deposit (25%), or (c) Pay on Arrival.</w:t>
+        <w:br/>
+        <w:t>• Features 5 tabbed payment rails: Easypaisa, JazzCash, Visa/Mastercard 3DS, SBP Raast QR, and Pay-on-Arrival Guarantee.</w:t>
         <w:br/>
         <w:t>• Includes 1-Click 'Demo Auto-Fill' credentials for instant stakeholder demonstrations.</w:t>
         <w:br/>
-        <w:t>• On confirmation, issues a digital QR-coded invoice and transitions booking statuses to 'confirmed' and 'paid'.</w:t>
+        <w:t>• On confirmation, issues a digital QR-coded invoice and updates booking status to 'confirmed' with appropriate payment_status.</w:t>
       </w:r>
     </w:p>
     <w:p>
@@ -1769,9 +2240,11 @@
           <w:color w:val="2D3748"/>
           <w:sz w:val="19"/>
         </w:rPr>
-        <w:t>• Direct 'Check In Guest' button: Verifies reservation, stamps actual_checkin_at, shifts room from 'reserved' to 'occupied', and outputs WiFi/Key slip.</w:t>
+        <w:t>• Balance Due Calculation: Renders 'Deposit Paid: PKR 6,000 | Balance Due: PKR 18,000' for partial payments.</w:t>
         <w:br/>
-        <w:t>• Direct 'Check Out Guest' button: Produces final billing summary, shifts room to 'cleaning' status, marks booking 'completed', and sends review trigger.</w:t>
+        <w:t>• Direct 'Check In Guest' button: Verifies reservation, stamps actual_checkin_at, shifts room from 'reserved' to 'occupied'.</w:t>
+        <w:br/>
+        <w:t>• Direct 'Check Out Guest' button: Produces final billing summary, shifts room to 'cleaning' status, and marks booking 'completed'.</w:t>
         <w:br/>
         <w:t>• Housekeeping Quick-Release: Staff click 'Mark Cleaned' on room card to return room to 'available' inventory.</w:t>
         <w:br/>
@@ -1821,7 +2294,7 @@
           <w:color w:val="0A4D68"/>
           <w:sz w:val="32"/>
         </w:rPr>
-        <w:t>6. Technical Implementation Roadmap &amp; Verification Metrics</w:t>
+        <w:t>7. Technical Implementation Roadmap &amp; Verification Metrics</w:t>
       </w:r>
     </w:p>
     <w:tbl>
@@ -1984,7 +2457,7 @@
                 <w:color w:val="2D3748"/>
                 <w:sz w:val="18"/>
               </w:rPr>
-              <w:t>Develop unified SwatPayModal.tsx with 5 channels, order breakdown, and demo auto-fill.</w:t>
+              <w:t>Develop unified SwatPayModal.tsx with Full vs. Partial Deposit selector, 5 payment channels, and demo auto-fill.</w:t>
             </w:r>
           </w:p>
         </w:tc>
@@ -2166,7 +2639,7 @@
                 <w:color w:val="2D3748"/>
                 <w:sz w:val="18"/>
               </w:rPr>
-              <w:t>Implement Check-In, Check-Out, and Room Turnover actions on HotelTodayScreen.</w:t>
+              <w:t>Implement Check-In, Check-Out, and Deposit Balance Due on HotelTodayScreen.</w:t>
             </w:r>
           </w:p>
         </w:tc>
@@ -2212,7 +2685,7 @@
                 <w:color w:val="2D3748"/>
                 <w:sz w:val="18"/>
               </w:rPr>
-              <w:t>Room statuses transition correctly in rack</w:t>
+              <w:t>Balance due and room status reflect in real-time</w:t>
             </w:r>
           </w:p>
         </w:tc>
@@ -2467,7 +2940,7 @@
         <w:color w:val="888888"/>
         <w:sz w:val="17"/>
       </w:rPr>
-      <w:t>Swat Tourism Platform v2.0 | Architectural Gap Analysis</w:t>
+      <w:t>Swat Tourism Platform v2.0 | Architectural Gap Analysis &amp; Advance Payment Policy</w:t>
     </w:r>
   </w:p>
 </w:hdr>

</xml_diff>